<commit_message>
Add week-3/4 work: uncertainty, acceptance, GAM, demo, and docs
- Analysis: ceteris paribus (14), feature-selection notebooks renamed to 15-17,
  overview notebooks renamed to 00a-00c, figure-generation notebook (90)
- Model: quantile/UQ training (05-07), uncertainty/ and acceptance/ pipelines,
  evaluation notebooks 00 and 06-08, project overview (99)
- Docs: week-3 and uncertainty reports, architecture summary, ~200 new figures
- Project notes: CAU_TRUC_DU_AN, VIEC_CAN_LAM, VIEC_TUAN_4, BIEN_BAN_CHAY_LAI
- Reference papers (PDF)

Co-Authored-By: Claude Opus 5 <noreply@anthropic.com>
</commit_message>
<xml_diff>
--- a/TP_HCM_data/docs/bao_cao_tuan2_HOAN_CHINH.docx
+++ b/TP_HCM_data/docs/bao_cao_tuan2_HOAN_CHINH.docx
@@ -17241,7 +17241,7 @@
       <w:r>
         <w:drawing>
           <wp:inline xmlns:a="http://schemas.openxmlformats.org/drawingml/2006/main" xmlns:pic="http://schemas.openxmlformats.org/drawingml/2006/picture">
-            <wp:extent cx="5486400" cy="1893464"/>
+            <wp:extent cx="5486400" cy="1876065"/>
             <wp:docPr id="15" name="Picture 15"/>
             <wp:cNvGraphicFramePr>
               <a:graphicFrameLocks noChangeAspect="1"/>
@@ -17262,7 +17262,7 @@
                   <pic:spPr>
                     <a:xfrm>
                       <a:off x="0" y="0"/>
-                      <a:ext cx="5486400" cy="1893464"/>
+                      <a:ext cx="5486400" cy="1876065"/>
                     </a:xfrm>
                     <a:prstGeom prst="rect"/>
                   </pic:spPr>
@@ -17677,7 +17677,7 @@
       <w:r>
         <w:drawing>
           <wp:inline xmlns:a="http://schemas.openxmlformats.org/drawingml/2006/main" xmlns:pic="http://schemas.openxmlformats.org/drawingml/2006/picture">
-            <wp:extent cx="5486400" cy="2666696"/>
+            <wp:extent cx="5486400" cy="2653214"/>
             <wp:docPr id="16" name="Picture 16"/>
             <wp:cNvGraphicFramePr>
               <a:graphicFrameLocks noChangeAspect="1"/>
@@ -17698,7 +17698,7 @@
                   <pic:spPr>
                     <a:xfrm>
                       <a:off x="0" y="0"/>
-                      <a:ext cx="5486400" cy="2666696"/>
+                      <a:ext cx="5486400" cy="2653214"/>
                     </a:xfrm>
                     <a:prstGeom prst="rect"/>
                   </pic:spPr>
@@ -17823,7 +17823,7 @@
       <w:r>
         <w:drawing>
           <wp:inline xmlns:a="http://schemas.openxmlformats.org/drawingml/2006/main" xmlns:pic="http://schemas.openxmlformats.org/drawingml/2006/picture">
-            <wp:extent cx="5486400" cy="1889790"/>
+            <wp:extent cx="5486400" cy="1876065"/>
             <wp:docPr id="17" name="Picture 17"/>
             <wp:cNvGraphicFramePr>
               <a:graphicFrameLocks noChangeAspect="1"/>
@@ -17844,7 +17844,7 @@
                   <pic:spPr>
                     <a:xfrm>
                       <a:off x="0" y="0"/>
-                      <a:ext cx="5486400" cy="1889790"/>
+                      <a:ext cx="5486400" cy="1876065"/>
                     </a:xfrm>
                     <a:prstGeom prst="rect"/>
                   </pic:spPr>
@@ -18409,7 +18409,7 @@
       <w:r>
         <w:drawing>
           <wp:inline xmlns:a="http://schemas.openxmlformats.org/drawingml/2006/main" xmlns:pic="http://schemas.openxmlformats.org/drawingml/2006/picture">
-            <wp:extent cx="5486400" cy="1887059"/>
+            <wp:extent cx="5486400" cy="1877859"/>
             <wp:docPr id="18" name="Picture 18"/>
             <wp:cNvGraphicFramePr>
               <a:graphicFrameLocks noChangeAspect="1"/>
@@ -18430,7 +18430,7 @@
                   <pic:spPr>
                     <a:xfrm>
                       <a:off x="0" y="0"/>
-                      <a:ext cx="5486400" cy="1887059"/>
+                      <a:ext cx="5486400" cy="1877859"/>
                     </a:xfrm>
                     <a:prstGeom prst="rect"/>
                   </pic:spPr>
@@ -21261,7 +21261,7 @@
                 <w:rFonts w:ascii="Calibri" w:hAnsi="Calibri"/>
                 <w:sz w:val="20"/>
               </w:rPr>
-              <w:t>dựng từ model/_archive/pred_hybrid_pipeline_cu.parquet + evaluation/pred_gia.parquet, gắn mốc thời gian từ data/hcm_train_ready.parquet</w:t>
+              <w:t>model/evaluation/06_plot_uncertainty.ipynb</w:t>
             </w:r>
           </w:p>
         </w:tc>

</xml_diff>